<commit_message>
Regenerate himservice anketa_HIMSERVICE.docx - full template
</commit_message>
<xml_diff>
--- a/clients/himservice/anketa_HIMSERVICE.docx
+++ b/clients/himservice/anketa_HIMSERVICE.docx
@@ -8,14 +8,37 @@
       </w:pPr>
       <w:r>
         <w:rPr>
+          <w:rFonts w:ascii="Times New Roman" w:hAnsi="Times New Roman"/>
+          <w:b/>
+          <w:sz w:val="22"/>
+        </w:rPr>
+        <w:t>КОНСАЛТИНГОВАЯ КОМПАНИЯ</w:t>
+        <w:br/>
+        <w:t>ANDROMEDA CONSULT</w:t>
+      </w:r>
+    </w:p>
+    <w:p>
+      <w:pPr>
+        <w:jc w:val="right"/>
+      </w:pPr>
+      <w:r>
+        <w:rPr>
+          <w:rFonts w:ascii="Times New Roman" w:hAnsi="Times New Roman"/>
           <w:color w:val="667788"/>
           <w:sz w:val="16"/>
         </w:rPr>
-        <w:t>КОНСАЛТИНГОВАЯ КОМПАНИЯ ANDROMEDA CONSULT</w:t>
+        <w:t>ИНН 7702464831  |  ОГРН 1197746181038  |  КПП 770201001</w:t>
         <w:br/>
-        <w:t>ИНН 7702464831 | ОГРН 1197746181038 | КПП 770201001</w:t>
-        <w:br/>
-        <w:t>info@andromedaconsult.ru | andromedaconsult.ru</w:t>
+        <w:t>info@andromedaconsult.ru  |  andromedaconsult.ru  |  @andromedaconsult</w:t>
+      </w:r>
+    </w:p>
+    <w:p>
+      <w:r>
+        <w:rPr>
+          <w:color w:val="CCCCCC"/>
+          <w:sz w:val="12"/>
+        </w:rPr>
+        <w:t>────────────────────────────────────────────────────────────────────────────────</w:t>
       </w:r>
     </w:p>
     <w:p>
@@ -24,10 +47,12 @@
       </w:pPr>
       <w:r>
         <w:rPr>
+          <w:rFonts w:ascii="Times New Roman" w:hAnsi="Times New Roman"/>
           <w:b/>
           <w:sz w:val="28"/>
         </w:rPr>
-        <w:t>АНКЕТА КОМПАНИИ</w:t>
+        <w:br/>
+        <w:t>АНКЕТА ДЛЯ ЗАЯВКИ В СКОЛКОВО</w:t>
       </w:r>
     </w:p>
     <w:p>
@@ -36,253 +61,632 @@
       </w:pPr>
       <w:r>
         <w:rPr>
-          <w:sz w:val="20"/>
+          <w:rFonts w:ascii="Times New Roman" w:hAnsi="Times New Roman"/>
+          <w:b/>
+          <w:sz w:val="22"/>
         </w:rPr>
-        <w:t>для оценки возможности получения статуса резидента Фонда «Сколково»</w:t>
+        <w:t>ООО «Химсервис» (ИНН 7743149719)</w:t>
       </w:r>
     </w:p>
-    <w:p/>
     <w:p>
+      <w:pPr>
+        <w:jc w:val="center"/>
+      </w:pPr>
       <w:r>
         <w:rPr>
-          <w:b/>
-          <w:sz w:val="20"/>
+          <w:rFonts w:ascii="Times New Roman" w:hAnsi="Times New Roman"/>
+          <w:sz w:val="18"/>
         </w:rPr>
-        <w:t xml:space="preserve">Полное наименование: </w:t>
-      </w:r>
-      <w:r>
-        <w:rPr>
-          <w:color w:val="2ECC71"/>
-          <w:sz w:val="20"/>
-        </w:rPr>
-        <w:t>ООО «ХИМСЕРВИС»</w:t>
+        <w:t>Предварительно заполнено на основе открытых источников</w:t>
       </w:r>
     </w:p>
     <w:p>
       <w:r>
         <w:rPr>
+          <w:color w:val="CCCCCC"/>
+          <w:sz w:val="12"/>
+        </w:rPr>
+        <w:t>────────────────────────────────────────────────────────────────────────────────</w:t>
+      </w:r>
+    </w:p>
+    <w:p>
+      <w:pPr>
+        <w:spacing w:after="40"/>
+      </w:pPr>
+      <w:r>
+        <w:rPr>
+          <w:rFonts w:ascii="Times New Roman" w:hAnsi="Times New Roman"/>
+          <w:sz w:val="18"/>
+        </w:rPr>
+        <w:t>Условные обозначения: 🟢 — данные из открытых источников  |  🟡 — гипотезы (требуют подтверждения)  |  🔴 — данные отсутствуют</w:t>
+      </w:r>
+    </w:p>
+    <w:p>
+      <w:r>
+        <w:rPr>
+          <w:rFonts w:ascii="Times New Roman" w:hAnsi="Times New Roman"/>
+          <w:b/>
+          <w:sz w:val="24"/>
+        </w:rPr>
+        <w:br/>
+        <w:t>1. Данные от личного кабинета (lk.sk.ru)</w:t>
+      </w:r>
+    </w:p>
+    <w:p>
+      <w:pPr>
+        <w:spacing w:after="40"/>
+      </w:pPr>
+      <w:r>
+        <w:rPr>
+          <w:rFonts w:ascii="Times New Roman" w:hAnsi="Times New Roman"/>
           <w:b/>
           <w:sz w:val="20"/>
         </w:rPr>
-        <w:t xml:space="preserve">ИНН: </w:t>
+        <w:t xml:space="preserve">🔴 Данные личного кабинета: </w:t>
       </w:r>
       <w:r>
         <w:rPr>
-          <w:color w:val="2ECC71"/>
+          <w:rFonts w:ascii="Times New Roman" w:hAnsi="Times New Roman"/>
+          <w:color w:val="CC3333"/>
+          <w:sz w:val="20"/>
+        </w:rPr>
+        <w:t>Не получены. Требуется регистрация на lk.sk.ru</w:t>
+      </w:r>
+    </w:p>
+    <w:p>
+      <w:r>
+        <w:rPr>
+          <w:rFonts w:ascii="Times New Roman" w:hAnsi="Times New Roman"/>
+          <w:b/>
+          <w:sz w:val="24"/>
+        </w:rPr>
+        <w:br/>
+        <w:t>2. Информация о компании</w:t>
+      </w:r>
+    </w:p>
+    <w:p>
+      <w:pPr>
+        <w:spacing w:after="40"/>
+      </w:pPr>
+      <w:r>
+        <w:rPr>
+          <w:rFonts w:ascii="Times New Roman" w:hAnsi="Times New Roman"/>
+          <w:b/>
+          <w:sz w:val="20"/>
+        </w:rPr>
+        <w:t xml:space="preserve">🟢 Полное наименование: </w:t>
+      </w:r>
+      <w:r>
+        <w:rPr>
+          <w:rFonts w:ascii="Times New Roman" w:hAnsi="Times New Roman"/>
+          <w:sz w:val="20"/>
+        </w:rPr>
+        <w:t>ОБЩЕСТВО С ОГРАНИЧЕННОЙ ОТВЕТСТВЕННОСТЬЮ «ХИМСЕРВИС»</w:t>
+      </w:r>
+    </w:p>
+    <w:p>
+      <w:pPr>
+        <w:spacing w:after="40"/>
+      </w:pPr>
+      <w:r>
+        <w:rPr>
+          <w:rFonts w:ascii="Times New Roman" w:hAnsi="Times New Roman"/>
+          <w:b/>
+          <w:sz w:val="20"/>
+        </w:rPr>
+        <w:t xml:space="preserve">🟢 ИНН: </w:t>
+      </w:r>
+      <w:r>
+        <w:rPr>
+          <w:rFonts w:ascii="Times New Roman" w:hAnsi="Times New Roman"/>
           <w:sz w:val="20"/>
         </w:rPr>
         <w:t>7743149719</w:t>
       </w:r>
     </w:p>
     <w:p>
+      <w:pPr>
+        <w:spacing w:after="40"/>
+      </w:pPr>
       <w:r>
         <w:rPr>
+          <w:rFonts w:ascii="Times New Roman" w:hAnsi="Times New Roman"/>
           <w:b/>
           <w:sz w:val="20"/>
         </w:rPr>
-        <w:t xml:space="preserve">ОГРН: </w:t>
+        <w:t xml:space="preserve">🟢 ОГРН: </w:t>
       </w:r>
       <w:r>
         <w:rPr>
-          <w:color w:val="2ECC71"/>
+          <w:rFonts w:ascii="Times New Roman" w:hAnsi="Times New Roman"/>
           <w:sz w:val="20"/>
         </w:rPr>
         <w:t>1167746345832</w:t>
       </w:r>
     </w:p>
     <w:p>
+      <w:pPr>
+        <w:spacing w:after="40"/>
+      </w:pPr>
       <w:r>
         <w:rPr>
+          <w:rFonts w:ascii="Times New Roman" w:hAnsi="Times New Roman"/>
           <w:b/>
           <w:sz w:val="20"/>
         </w:rPr>
-        <w:t xml:space="preserve">Дата регистрации: </w:t>
+        <w:t xml:space="preserve">🟢 Дата регистрации: </w:t>
       </w:r>
       <w:r>
         <w:rPr>
-          <w:color w:val="2ECC71"/>
+          <w:rFonts w:ascii="Times New Roman" w:hAnsi="Times New Roman"/>
           <w:sz w:val="20"/>
         </w:rPr>
-        <w:t>06.04.2016</w:t>
+        <w:t>2016 год</w:t>
+      </w:r>
+    </w:p>
+    <w:p>
+      <w:pPr>
+        <w:spacing w:after="40"/>
+      </w:pPr>
+      <w:r>
+        <w:rPr>
+          <w:rFonts w:ascii="Times New Roman" w:hAnsi="Times New Roman"/>
+          <w:b/>
+          <w:sz w:val="20"/>
+        </w:rPr>
+        <w:t xml:space="preserve">🟢 Юридический адрес: </w:t>
+      </w:r>
+      <w:r>
+        <w:rPr>
+          <w:rFonts w:ascii="Times New Roman" w:hAnsi="Times New Roman"/>
+          <w:sz w:val="20"/>
+        </w:rPr>
+        <w:t>г. Москва, Каширское шоссе, д. 94, к. 2</w:t>
+      </w:r>
+    </w:p>
+    <w:p>
+      <w:pPr>
+        <w:spacing w:after="40"/>
+      </w:pPr>
+      <w:r>
+        <w:rPr>
+          <w:rFonts w:ascii="Times New Roman" w:hAnsi="Times New Roman"/>
+          <w:b/>
+          <w:sz w:val="20"/>
+        </w:rPr>
+        <w:t xml:space="preserve">🟢 Руководитель: </w:t>
+      </w:r>
+      <w:r>
+        <w:rPr>
+          <w:rFonts w:ascii="Times New Roman" w:hAnsi="Times New Roman"/>
+          <w:sz w:val="20"/>
+        </w:rPr>
+        <w:t>Соколов Евгений Николаевич</w:t>
+      </w:r>
+    </w:p>
+    <w:p>
+      <w:pPr>
+        <w:spacing w:after="40"/>
+      </w:pPr>
+      <w:r>
+        <w:rPr>
+          <w:rFonts w:ascii="Times New Roman" w:hAnsi="Times New Roman"/>
+          <w:b/>
+          <w:sz w:val="20"/>
+        </w:rPr>
+        <w:t xml:space="preserve">🟢 ОКВЭД основной: </w:t>
+      </w:r>
+      <w:r>
+        <w:rPr>
+          <w:rFonts w:ascii="Times New Roman" w:hAnsi="Times New Roman"/>
+          <w:sz w:val="20"/>
+        </w:rPr>
+        <w:t>20.59 — Производство прочих химических продуктов</w:t>
+      </w:r>
+    </w:p>
+    <w:p>
+      <w:pPr>
+        <w:spacing w:after="40"/>
+      </w:pPr>
+      <w:r>
+        <w:rPr>
+          <w:rFonts w:ascii="Times New Roman" w:hAnsi="Times New Roman"/>
+          <w:b/>
+          <w:sz w:val="20"/>
+        </w:rPr>
+        <w:t xml:space="preserve">🟡 ОКВЭД 72 (для Сколково): </w:t>
+      </w:r>
+      <w:r>
+        <w:rPr>
+          <w:rFonts w:ascii="Times New Roman" w:hAnsi="Times New Roman"/>
+          <w:color w:val="CC8800"/>
+          <w:sz w:val="20"/>
+        </w:rPr>
+        <w:t>Не внесён. Требуется внесение изменений в ЕГРЮЛ или создание нового юрлица</w:t>
+      </w:r>
+    </w:p>
+    <w:p>
+      <w:pPr>
+        <w:spacing w:after="40"/>
+      </w:pPr>
+      <w:r>
+        <w:rPr>
+          <w:rFonts w:ascii="Times New Roman" w:hAnsi="Times New Roman"/>
+          <w:b/>
+          <w:sz w:val="20"/>
+        </w:rPr>
+        <w:t xml:space="preserve">🟢 Сотрудники: </w:t>
+      </w:r>
+      <w:r>
+        <w:rPr>
+          <w:rFonts w:ascii="Times New Roman" w:hAnsi="Times New Roman"/>
+          <w:sz w:val="20"/>
+        </w:rPr>
+        <w:t>~12 чел.</w:t>
+      </w:r>
+    </w:p>
+    <w:p>
+      <w:pPr>
+        <w:spacing w:after="40"/>
+      </w:pPr>
+      <w:r>
+        <w:rPr>
+          <w:rFonts w:ascii="Times New Roman" w:hAnsi="Times New Roman"/>
+          <w:b/>
+          <w:sz w:val="20"/>
+        </w:rPr>
+        <w:t xml:space="preserve">🟢 Выручка 2025: </w:t>
+      </w:r>
+      <w:r>
+        <w:rPr>
+          <w:rFonts w:ascii="Times New Roman" w:hAnsi="Times New Roman"/>
+          <w:sz w:val="20"/>
+        </w:rPr>
+        <w:t>547,4 млн ₽</w:t>
+      </w:r>
+    </w:p>
+    <w:p>
+      <w:pPr>
+        <w:spacing w:after="40"/>
+      </w:pPr>
+      <w:r>
+        <w:rPr>
+          <w:rFonts w:ascii="Times New Roman" w:hAnsi="Times New Roman"/>
+          <w:b/>
+          <w:sz w:val="20"/>
+        </w:rPr>
+        <w:t xml:space="preserve">🟢 Прибыль 2025: </w:t>
+      </w:r>
+      <w:r>
+        <w:rPr>
+          <w:rFonts w:ascii="Times New Roman" w:hAnsi="Times New Roman"/>
+          <w:sz w:val="20"/>
+        </w:rPr>
+        <w:t>5,8 млн ₽</w:t>
+      </w:r>
+    </w:p>
+    <w:p>
+      <w:pPr>
+        <w:spacing w:after="40"/>
+      </w:pPr>
+      <w:r>
+        <w:rPr>
+          <w:rFonts w:ascii="Times New Roman" w:hAnsi="Times New Roman"/>
+          <w:b/>
+          <w:sz w:val="20"/>
+        </w:rPr>
+        <w:t xml:space="preserve">🟡 Контактные телефоны/Email: </w:t>
+      </w:r>
+      <w:r>
+        <w:rPr>
+          <w:rFonts w:ascii="Times New Roman" w:hAnsi="Times New Roman"/>
+          <w:color w:val="CC8800"/>
+          <w:sz w:val="20"/>
+        </w:rPr>
+        <w:t>Требуется уточнить у клиента</w:t>
+      </w:r>
+    </w:p>
+    <w:p>
+      <w:pPr>
+        <w:spacing w:after="40"/>
+      </w:pPr>
+      <w:r>
+        <w:rPr>
+          <w:rFonts w:ascii="Times New Roman" w:hAnsi="Times New Roman"/>
+          <w:b/>
+          <w:sz w:val="20"/>
+        </w:rPr>
+        <w:t xml:space="preserve">🔴 Сайт компании: </w:t>
+      </w:r>
+      <w:r>
+        <w:rPr>
+          <w:rFonts w:ascii="Times New Roman" w:hAnsi="Times New Roman"/>
+          <w:color w:val="CC3333"/>
+          <w:sz w:val="20"/>
+        </w:rPr>
+        <w:t>Не найден</w:t>
       </w:r>
     </w:p>
     <w:p>
       <w:r>
         <w:rPr>
+          <w:rFonts w:ascii="Times New Roman" w:hAnsi="Times New Roman"/>
+          <w:b/>
+          <w:sz w:val="24"/>
+        </w:rPr>
+        <w:br/>
+        <w:t>3. Научно-технический критерий</w:t>
+      </w:r>
+    </w:p>
+    <w:p>
+      <w:pPr>
+        <w:spacing w:after="40"/>
+      </w:pPr>
+      <w:r>
+        <w:rPr>
+          <w:rFonts w:ascii="Times New Roman" w:hAnsi="Times New Roman"/>
           <w:b/>
           <w:sz w:val="20"/>
         </w:rPr>
-        <w:t xml:space="preserve">Руководитель: </w:t>
+        <w:t xml:space="preserve">🟡 Гипотеза по продукту-инновации: </w:t>
       </w:r>
       <w:r>
         <w:rPr>
-          <w:color w:val="2ECC71"/>
+          <w:rFonts w:ascii="Times New Roman" w:hAnsi="Times New Roman"/>
+          <w:color w:val="CC8800"/>
           <w:sz w:val="20"/>
         </w:rPr>
-        <w:t>Диков Олег Станиславович (генеральный директор)</w:t>
+        <w:t>Разработка технологии производства химической продукции с улучшенными свойствами</w:t>
+      </w:r>
+    </w:p>
+    <w:p>
+      <w:pPr>
+        <w:spacing w:after="40"/>
+      </w:pPr>
+      <w:r>
+        <w:rPr>
+          <w:rFonts w:ascii="Times New Roman" w:hAnsi="Times New Roman"/>
+          <w:b/>
+          <w:sz w:val="20"/>
+        </w:rPr>
+        <w:t xml:space="preserve">🟡 Направления инновации: </w:t>
+      </w:r>
+      <w:r>
+        <w:rPr>
+          <w:rFonts w:ascii="Times New Roman" w:hAnsi="Times New Roman"/>
+          <w:color w:val="CC8800"/>
+          <w:sz w:val="20"/>
+        </w:rPr>
+        <w:t>Химические реактивы, рецептуры, очистка, контроль качества</w:t>
+      </w:r>
+    </w:p>
+    <w:p>
+      <w:pPr>
+        <w:spacing w:after="40"/>
+      </w:pPr>
+      <w:r>
+        <w:rPr>
+          <w:rFonts w:ascii="Times New Roman" w:hAnsi="Times New Roman"/>
+          <w:b/>
+          <w:sz w:val="20"/>
+        </w:rPr>
+        <w:t xml:space="preserve">🟡 Патенты / заявки на ИС: </w:t>
+      </w:r>
+      <w:r>
+        <w:rPr>
+          <w:rFonts w:ascii="Times New Roman" w:hAnsi="Times New Roman"/>
+          <w:color w:val="CC8800"/>
+          <w:sz w:val="20"/>
+        </w:rPr>
+        <w:t>Не найдены</w:t>
+      </w:r>
+    </w:p>
+    <w:p>
+      <w:pPr>
+        <w:spacing w:after="40"/>
+      </w:pPr>
+      <w:r>
+        <w:rPr>
+          <w:rFonts w:ascii="Times New Roman" w:hAnsi="Times New Roman"/>
+          <w:b/>
+          <w:sz w:val="20"/>
+        </w:rPr>
+        <w:t xml:space="preserve">🔴 Научные публикации: </w:t>
+      </w:r>
+      <w:r>
+        <w:rPr>
+          <w:rFonts w:ascii="Times New Roman" w:hAnsi="Times New Roman"/>
+          <w:color w:val="CC3333"/>
+          <w:sz w:val="20"/>
+        </w:rPr>
+        <w:t>Не найдены</w:t>
       </w:r>
     </w:p>
     <w:p>
       <w:r>
         <w:rPr>
+          <w:rFonts w:ascii="Times New Roman" w:hAnsi="Times New Roman"/>
+          <w:b/>
+          <w:sz w:val="24"/>
+        </w:rPr>
+        <w:br/>
+        <w:t>4. Критерий материально-технической базы</w:t>
+      </w:r>
+    </w:p>
+    <w:p>
+      <w:pPr>
+        <w:spacing w:after="40"/>
+      </w:pPr>
+      <w:r>
+        <w:rPr>
+          <w:rFonts w:ascii="Times New Roman" w:hAnsi="Times New Roman"/>
           <w:b/>
           <w:sz w:val="20"/>
         </w:rPr>
-        <w:t xml:space="preserve">Учредитель: </w:t>
+        <w:t xml:space="preserve">🟢 Персонал: </w:t>
       </w:r>
       <w:r>
         <w:rPr>
-          <w:color w:val="2ECC71"/>
+          <w:rFonts w:ascii="Times New Roman" w:hAnsi="Times New Roman"/>
           <w:sz w:val="20"/>
         </w:rPr>
-        <w:t>Диков Олег Станиславович (100%)</w:t>
+        <w:t>~12 чел. сотрудников</w:t>
+      </w:r>
+    </w:p>
+    <w:p>
+      <w:pPr>
+        <w:spacing w:after="40"/>
+      </w:pPr>
+      <w:r>
+        <w:rPr>
+          <w:rFonts w:ascii="Times New Roman" w:hAnsi="Times New Roman"/>
+          <w:b/>
+          <w:sz w:val="20"/>
+        </w:rPr>
+        <w:t xml:space="preserve">🟡 Производственная база: </w:t>
+      </w:r>
+      <w:r>
+        <w:rPr>
+          <w:rFonts w:ascii="Times New Roman" w:hAnsi="Times New Roman"/>
+          <w:color w:val="CC8800"/>
+          <w:sz w:val="20"/>
+        </w:rPr>
+        <w:t>Подтверждено — наличие производства</w:t>
       </w:r>
     </w:p>
     <w:p>
       <w:r>
         <w:rPr>
+          <w:rFonts w:ascii="Times New Roman" w:hAnsi="Times New Roman"/>
+          <w:b/>
+          <w:sz w:val="24"/>
+        </w:rPr>
+        <w:br/>
+        <w:t>5. Научно-техническая анкета (НИОКР)</w:t>
+      </w:r>
+    </w:p>
+    <w:p>
+      <w:pPr>
+        <w:spacing w:after="40"/>
+      </w:pPr>
+      <w:r>
+        <w:rPr>
+          <w:rFonts w:ascii="Times New Roman" w:hAnsi="Times New Roman"/>
           <w:b/>
           <w:sz w:val="20"/>
         </w:rPr>
-        <w:t xml:space="preserve">Юридический адрес: </w:t>
+        <w:t xml:space="preserve">🔴 Требуется заполнение: </w:t>
       </w:r>
       <w:r>
         <w:rPr>
-          <w:color w:val="2ECC71"/>
+          <w:rFonts w:ascii="Times New Roman" w:hAnsi="Times New Roman"/>
+          <w:color w:val="CC3333"/>
           <w:sz w:val="20"/>
         </w:rPr>
-        <w:t>108811, г. Москва, д. Саларьево, ул. 1-я Новая, д. 7, пом. 49Н/2</w:t>
+        <w:t>Совместно с клиентом: описание технологии, инновации, ТТХ, смета, календарный план</w:t>
       </w:r>
     </w:p>
     <w:p>
       <w:r>
         <w:rPr>
+          <w:rFonts w:ascii="Times New Roman" w:hAnsi="Times New Roman"/>
+          <w:b/>
+          <w:sz w:val="24"/>
+        </w:rPr>
+        <w:br/>
+        <w:t>6. Проект технического задания на выполнение НИОКР</w:t>
+      </w:r>
+    </w:p>
+    <w:p>
+      <w:pPr>
+        <w:spacing w:after="40"/>
+      </w:pPr>
+      <w:r>
+        <w:rPr>
+          <w:rFonts w:ascii="Times New Roman" w:hAnsi="Times New Roman"/>
           <w:b/>
           <w:sz w:val="20"/>
         </w:rPr>
-        <w:t xml:space="preserve">Телефон: </w:t>
+        <w:t xml:space="preserve">🔴 ТЗ: </w:t>
       </w:r>
       <w:r>
         <w:rPr>
-          <w:color w:val="2ECC71"/>
+          <w:rFonts w:ascii="Times New Roman" w:hAnsi="Times New Roman"/>
+          <w:color w:val="CC3333"/>
           <w:sz w:val="20"/>
         </w:rPr>
-        <w:t>+7 (985) 458-11-15</w:t>
+        <w:t>Разрабатывается после согласования продукта-инновации с клиентом</w:t>
       </w:r>
     </w:p>
     <w:p>
       <w:r>
         <w:rPr>
+          <w:rFonts w:ascii="Times New Roman" w:hAnsi="Times New Roman"/>
           <w:b/>
-          <w:sz w:val="20"/>
+          <w:sz w:val="24"/>
         </w:rPr>
-        <w:t xml:space="preserve">Основной ОКВЭД: </w:t>
-      </w:r>
-      <w:r>
-        <w:rPr>
-          <w:color w:val="2ECC71"/>
-          <w:sz w:val="20"/>
-        </w:rPr>
-        <w:t>20.41 — Производство мыла и моющих, чистящих и полирующих средств</w:t>
+        <w:br/>
+        <w:t>Примечания для аналитиков</w:t>
       </w:r>
     </w:p>
     <w:p>
+      <w:pPr>
+        <w:spacing w:after="40"/>
+      </w:pPr>
       <w:r>
         <w:rPr>
-          <w:b/>
+          <w:rFonts w:ascii="Times New Roman" w:hAnsi="Times New Roman"/>
           <w:sz w:val="20"/>
         </w:rPr>
-        <w:t xml:space="preserve">Налоговый режим: </w:t>
-      </w:r>
-      <w:r>
-        <w:rPr>
-          <w:color w:val="2ECC71"/>
-          <w:sz w:val="20"/>
-        </w:rPr>
-        <w:t>ОСН</w:t>
+        <w:t>Патент: если у клиента нет патента — работаем с патентоведом. Заявка подаётся параллельно с заявкой в Сколково.</w:t>
       </w:r>
     </w:p>
     <w:p>
+      <w:pPr>
+        <w:spacing w:after="40"/>
+      </w:pPr>
       <w:r>
         <w:rPr>
-          <w:b/>
+          <w:rFonts w:ascii="Times New Roman" w:hAnsi="Times New Roman"/>
           <w:sz w:val="20"/>
         </w:rPr>
-        <w:t xml:space="preserve">Выручка (2025): </w:t>
-      </w:r>
-      <w:r>
-        <w:rPr>
-          <w:color w:val="2ECC71"/>
-          <w:sz w:val="20"/>
-        </w:rPr>
-        <w:t>547 млн ₽</w:t>
+        <w:t>Стоимость продукта и количество продаж — запрашиваются у клиента.</w:t>
       </w:r>
     </w:p>
     <w:p>
+      <w:pPr>
+        <w:spacing w:after="40"/>
+      </w:pPr>
       <w:r>
         <w:rPr>
-          <w:b/>
+          <w:rFonts w:ascii="Times New Roman" w:hAnsi="Times New Roman"/>
           <w:sz w:val="20"/>
         </w:rPr>
-        <w:t xml:space="preserve">Чистая прибыль (2025): </w:t>
-      </w:r>
-      <w:r>
-        <w:rPr>
-          <w:color w:val="2ECC71"/>
-          <w:sz w:val="20"/>
-        </w:rPr>
-        <w:t>29,3 млн ₽</w:t>
+        <w:t>Сайт компании не обнаружен. Рекомендовать клиенту создать минимальную страницу с описанием продукции.</w:t>
       </w:r>
     </w:p>
     <w:p>
+      <w:pPr>
+        <w:spacing w:after="40"/>
+      </w:pPr>
       <w:r>
         <w:rPr>
-          <w:b/>
+          <w:rFonts w:ascii="Times New Roman" w:hAnsi="Times New Roman"/>
           <w:sz w:val="20"/>
         </w:rPr>
-        <w:t xml:space="preserve">Численность сотрудников: </w:t>
-      </w:r>
-      <w:r>
-        <w:rPr>
-          <w:color w:val="F39C12"/>
-          <w:sz w:val="20"/>
-        </w:rPr>
-        <w:t>~25 чел. (оценка)</w:t>
+        <w:t>На весь процесс клиент тратит 3–5 рабочих дней команды.</w:t>
       </w:r>
     </w:p>
     <w:p>
+      <w:pPr>
+        <w:spacing w:after="40"/>
+      </w:pPr>
       <w:r>
         <w:rPr>
-          <w:b/>
+          <w:rFonts w:ascii="Times New Roman" w:hAnsi="Times New Roman"/>
           <w:sz w:val="20"/>
         </w:rPr>
-        <w:t xml:space="preserve">Наличие патентов: </w:t>
-      </w:r>
-      <w:r>
-        <w:rPr>
-          <w:color w:val="F39C12"/>
-          <w:sz w:val="20"/>
-        </w:rPr>
-        <w:t>Требуется патентный аудит</w:t>
-      </w:r>
-    </w:p>
-    <w:p/>
-    <w:p>
-      <w:r>
-        <w:rPr>
-          <w:b/>
-          <w:sz w:val="20"/>
-        </w:rPr>
-        <w:t xml:space="preserve">Гипотеза по инновации: </w:t>
-      </w:r>
-    </w:p>
-    <w:p>
-      <w:r>
-        <w:rPr>
-          <w:color w:val="F39C12"/>
-          <w:sz w:val="20"/>
-        </w:rPr>
-        <w:t>Инновация может заключаться в рецептурах моющих средств, технологии производства, контроле качества. Требуется обсуждение с руководителем.</w:t>
+        <w:t>Рекомендуемая инновация — разработка технологии производства химической продукции с улучшенными свойствами.</w:t>
       </w:r>
     </w:p>
     <w:sectPr>
@@ -658,6 +1062,9 @@
     <w:name w:val="Normal"/>
     <w:qFormat/>
     <w:rsid w:val="00FC693F"/>
+    <w:pPr>
+      <w:spacing w:line="276" w:lineRule="auto"/>
+    </w:pPr>
     <w:rPr>
       <w:rFonts w:ascii="Times New Roman" w:hAnsi="Times New Roman"/>
       <w:sz w:val="22"/>

</xml_diff>